<commit_message>
Online process for document request, blotter and case module
</commit_message>
<xml_diff>
--- a/storage/app/public/document-templates/KP-Form-8-Patawag-Complainant.docx
+++ b/storage/app/public/document-templates/KP-Form-8-Patawag-Complainant.docx
@@ -330,7 +330,6 @@
           <w:lang w:val="en-US"/>
         </w:rPr>
       </w:pPr>
-      <w:proofErr w:type="spellStart"/>
       <w:r>
         <w:rPr>
           <w:bCs/>
@@ -338,37 +337,7 @@
           <w:szCs w:val="18"/>
           <w:lang w:val="en-US"/>
         </w:rPr>
-        <w:t>Pormularyo</w:t>
-      </w:r>
-      <w:proofErr w:type="spellEnd"/>
-      <w:r>
-        <w:rPr>
-          <w:bCs/>
-          <w:sz w:val="18"/>
-          <w:szCs w:val="18"/>
-          <w:lang w:val="en-US"/>
-        </w:rPr>
-        <w:t xml:space="preserve"> ng KP </w:t>
-      </w:r>
-      <w:proofErr w:type="spellStart"/>
-      <w:r>
-        <w:rPr>
-          <w:bCs/>
-          <w:sz w:val="18"/>
-          <w:szCs w:val="18"/>
-          <w:lang w:val="en-US"/>
-        </w:rPr>
-        <w:t>Blg</w:t>
-      </w:r>
-      <w:proofErr w:type="spellEnd"/>
-      <w:r>
-        <w:rPr>
-          <w:bCs/>
-          <w:sz w:val="18"/>
-          <w:szCs w:val="18"/>
-          <w:lang w:val="en-US"/>
-        </w:rPr>
-        <w:t>. 8</w:t>
+        <w:t>Pormularyo ng KP Blg. 8</w:t>
       </w:r>
     </w:p>
     <w:p>
@@ -479,59 +448,80 @@
           <w:szCs w:val="28"/>
           <w:lang w:val="en-US"/>
         </w:rPr>
-        <w:t xml:space="preserve">(Mga </w:t>
-      </w:r>
-      <w:proofErr w:type="spellStart"/>
+        <w:t>(Mga Hakbang ng Pamamagitan</w:t>
+      </w:r>
       <w:r>
         <w:rPr>
           <w:b/>
           <w:sz w:val="28"/>
           <w:szCs w:val="28"/>
-          <w:lang w:val="en-US"/>
-        </w:rPr>
-        <w:t>Hakbang</w:t>
-      </w:r>
-      <w:proofErr w:type="spellEnd"/>
-      <w:r>
+        </w:rPr>
+        <w:t>)</w:t>
+      </w:r>
+    </w:p>
+    <w:p>
+      <w:pPr>
+        <w:pStyle w:val="NoSpacing"/>
+        <w:ind w:left="720" w:firstLine="720"/>
+        <w:jc w:val="center"/>
         <w:rPr>
           <w:b/>
           <w:sz w:val="28"/>
           <w:szCs w:val="28"/>
-          <w:lang w:val="en-US"/>
-        </w:rPr>
-        <w:t xml:space="preserve"> ng </w:t>
-      </w:r>
-      <w:proofErr w:type="spellStart"/>
-      <w:r>
+        </w:rPr>
+      </w:pPr>
+    </w:p>
+    <w:p>
+      <w:pPr>
+        <w:pStyle w:val="NoSpacing"/>
+        <w:ind w:left="720" w:firstLine="720"/>
+        <w:jc w:val="both"/>
         <w:rPr>
           <w:b/>
           <w:sz w:val="28"/>
           <w:szCs w:val="28"/>
-          <w:lang w:val="en-US"/>
-        </w:rPr>
-        <w:t>Pamamagitan</w:t>
-      </w:r>
-      <w:proofErr w:type="spellEnd"/>
-      <w:r>
-        <w:rPr>
-          <w:b/>
-          <w:sz w:val="28"/>
-          <w:szCs w:val="28"/>
-        </w:rPr>
-        <w:t>)</w:t>
-      </w:r>
+        </w:rPr>
+      </w:pPr>
     </w:p>
     <w:p>
       <w:pPr>
         <w:pStyle w:val="NoSpacing"/>
         <w:ind w:left="720" w:firstLine="720"/>
-        <w:jc w:val="center"/>
-        <w:rPr>
-          <w:b/>
-          <w:sz w:val="28"/>
-          <w:szCs w:val="28"/>
-        </w:rPr>
-      </w:pPr>
+        <w:jc w:val="both"/>
+        <w:rPr>
+          <w:b/>
+        </w:rPr>
+      </w:pPr>
+      <w:r>
+        <w:rPr>
+          <w:b/>
+        </w:rPr>
+        <w:t>KAY : ___</w:t>
+      </w:r>
+      <w:r>
+        <w:rPr>
+          <w:b/>
+        </w:rPr>
+        <w:t>_${</w:t>
+      </w:r>
+      <w:r>
+        <w:rPr>
+          <w:b/>
+        </w:rPr>
+        <w:t>respondent</w:t>
+      </w:r>
+      <w:r>
+        <w:rPr>
+          <w:b/>
+        </w:rPr>
+        <w:t>_full_name} _</w:t>
+      </w:r>
+      <w:r>
+        <w:rPr>
+          <w:b/>
+        </w:rPr>
+        <w:t>_____</w:t>
+      </w:r>
     </w:p>
     <w:p>
       <w:pPr>
@@ -540,82 +530,20 @@
         <w:jc w:val="both"/>
         <w:rPr>
           <w:b/>
-          <w:sz w:val="28"/>
-          <w:szCs w:val="28"/>
-        </w:rPr>
-      </w:pPr>
+        </w:rPr>
+      </w:pPr>
+      <w:r>
+        <w:rPr>
+          <w:b/>
+        </w:rPr>
+        <w:t xml:space="preserve">          ________________________________</w:t>
+      </w:r>
     </w:p>
     <w:p>
       <w:pPr>
         <w:pStyle w:val="NoSpacing"/>
         <w:ind w:left="720" w:firstLine="720"/>
         <w:jc w:val="both"/>
-        <w:rPr>
-          <w:b/>
-        </w:rPr>
-      </w:pPr>
-      <w:proofErr w:type="gramStart"/>
-      <w:r>
-        <w:rPr>
-          <w:b/>
-        </w:rPr>
-        <w:t>KAY :</w:t>
-      </w:r>
-      <w:proofErr w:type="gramEnd"/>
-      <w:r>
-        <w:rPr>
-          <w:b/>
-        </w:rPr>
-        <w:t xml:space="preserve"> ___</w:t>
-      </w:r>
-      <w:r>
-        <w:rPr>
-          <w:b/>
-        </w:rPr>
-        <w:t>_${</w:t>
-      </w:r>
-      <w:proofErr w:type="spellStart"/>
-      <w:r>
-        <w:rPr>
-          <w:b/>
-        </w:rPr>
-        <w:t>complainant_full_name</w:t>
-      </w:r>
-      <w:proofErr w:type="spellEnd"/>
-      <w:r>
-        <w:rPr>
-          <w:b/>
-        </w:rPr>
-        <w:t>} _</w:t>
-      </w:r>
-      <w:r>
-        <w:rPr>
-          <w:b/>
-        </w:rPr>
-        <w:t>_____</w:t>
-      </w:r>
-    </w:p>
-    <w:p>
-      <w:pPr>
-        <w:pStyle w:val="NoSpacing"/>
-        <w:ind w:left="720" w:firstLine="720"/>
-        <w:jc w:val="both"/>
-        <w:rPr>
-          <w:b/>
-        </w:rPr>
-      </w:pPr>
-      <w:r>
-        <w:rPr>
-          <w:b/>
-        </w:rPr>
-        <w:t xml:space="preserve">          ________________________________</w:t>
-      </w:r>
-    </w:p>
-    <w:p>
-      <w:pPr>
-        <w:pStyle w:val="NoSpacing"/>
-        <w:ind w:left="720" w:firstLine="720"/>
-        <w:jc w:val="both"/>
       </w:pPr>
       <w:r>
         <w:rPr>
@@ -630,13 +558,8 @@
         <w:rPr>
           <w:lang w:val="en-US"/>
         </w:rPr>
-        <w:t>May</w:t>
-      </w:r>
-      <w:proofErr w:type="spellStart"/>
-      <w:r>
-        <w:t>sumbong</w:t>
-      </w:r>
-      <w:proofErr w:type="spellEnd"/>
+        <w:t>Inirereklamo</w:t>
+      </w:r>
     </w:p>
     <w:p>
       <w:pPr>
@@ -671,155 +594,75 @@
         <w:rPr>
           <w:lang w:val="en-US"/>
         </w:rPr>
-        <w:t xml:space="preserve">Ikaw ay </w:t>
-      </w:r>
-      <w:proofErr w:type="spellStart"/>
-      <w:r>
-        <w:rPr>
-          <w:lang w:val="en-US"/>
-        </w:rPr>
-        <w:t>inuutusan</w:t>
-      </w:r>
-      <w:proofErr w:type="spellEnd"/>
+        <w:t>Ikaw ay inuutusan na humarap sa akin sa</w:t>
+      </w:r>
       <w:r>
         <w:rPr>
           <w:lang w:val="en-US"/>
         </w:rPr>
         <w:t xml:space="preserve"> </w:t>
       </w:r>
-      <w:proofErr w:type="spellStart"/>
-      <w:r>
-        <w:rPr>
-          <w:lang w:val="en-US"/>
-        </w:rPr>
-        <w:t>na</w:t>
-      </w:r>
-      <w:proofErr w:type="spellEnd"/>
+      <w:r>
+        <w:rPr>
+          <w:lang w:val="en-US"/>
+        </w:rPr>
+        <w:tab/>
+        <w:t>${</w:t>
+      </w:r>
+      <w:r>
+        <w:rPr>
+          <w:lang w:val="en-US"/>
+        </w:rPr>
+        <w:t>location</w:t>
+      </w:r>
+      <w:r>
+        <w:rPr>
+          <w:lang w:val="en-US"/>
+        </w:rPr>
+        <w:t>}</w:t>
+      </w:r>
       <w:r>
         <w:rPr>
           <w:lang w:val="en-US"/>
         </w:rPr>
         <w:t xml:space="preserve"> </w:t>
       </w:r>
-      <w:proofErr w:type="spellStart"/>
-      <w:r>
-        <w:rPr>
-          <w:lang w:val="en-US"/>
-        </w:rPr>
-        <w:t>humarap</w:t>
-      </w:r>
-      <w:proofErr w:type="spellEnd"/>
+      <w:r>
+        <w:rPr>
+          <w:lang w:val="en-US"/>
+        </w:rPr>
+        <w:tab/>
+      </w:r>
+      <w:r>
+        <w:rPr>
+          <w:lang w:val="en-US"/>
+        </w:rPr>
+        <w:t>araw</w:t>
+      </w:r>
+      <w:r>
+        <w:rPr>
+          <w:lang w:val="en-US"/>
+        </w:rPr>
+        <w:t xml:space="preserve">  </w:t>
+      </w:r>
+      <w:r>
+        <w:rPr>
+          <w:lang w:val="en-US"/>
+        </w:rPr>
+        <w:t xml:space="preserve"> ng</w:t>
+      </w:r>
       <w:r>
         <w:rPr>
           <w:lang w:val="en-US"/>
         </w:rPr>
         <w:t xml:space="preserve"> </w:t>
       </w:r>
-      <w:proofErr w:type="spellStart"/>
-      <w:r>
-        <w:rPr>
-          <w:lang w:val="en-US"/>
-        </w:rPr>
-        <w:t>sa</w:t>
-      </w:r>
-      <w:proofErr w:type="spellEnd"/>
-      <w:r>
-        <w:rPr>
-          <w:lang w:val="en-US"/>
-        </w:rPr>
-        <w:t xml:space="preserve"> akin </w:t>
-      </w:r>
-      <w:proofErr w:type="spellStart"/>
-      <w:r>
-        <w:rPr>
-          <w:lang w:val="en-US"/>
-        </w:rPr>
-        <w:t>sa</w:t>
-      </w:r>
-      <w:proofErr w:type="spellEnd"/>
-      <w:r>
-        <w:rPr>
-          <w:lang w:val="en-US"/>
-        </w:rPr>
-        <w:t xml:space="preserve"> </w:t>
-      </w:r>
-      <w:r>
-        <w:rPr>
-          <w:lang w:val="en-US"/>
-        </w:rPr>
-        <w:tab/>
-        <w:t>${</w:t>
-      </w:r>
-      <w:r>
-        <w:rPr>
-          <w:lang w:val="en-US"/>
-        </w:rPr>
-        <w:t>location</w:t>
-      </w:r>
-      <w:r>
-        <w:rPr>
-          <w:lang w:val="en-US"/>
-        </w:rPr>
-        <w:t>}</w:t>
-      </w:r>
-      <w:r>
-        <w:rPr>
-          <w:lang w:val="en-US"/>
-        </w:rPr>
-        <w:t xml:space="preserve"> </w:t>
-      </w:r>
-      <w:r>
-        <w:rPr>
-          <w:lang w:val="en-US"/>
-        </w:rPr>
-        <w:tab/>
-      </w:r>
-      <w:proofErr w:type="spellStart"/>
-      <w:r>
-        <w:rPr>
-          <w:lang w:val="en-US"/>
-        </w:rPr>
-        <w:t>araw</w:t>
-      </w:r>
-      <w:proofErr w:type="spellEnd"/>
-      <w:r>
-        <w:rPr>
-          <w:lang w:val="en-US"/>
-        </w:rPr>
-        <w:t xml:space="preserve">  </w:t>
-      </w:r>
-      <w:r>
-        <w:rPr>
-          <w:lang w:val="en-US"/>
-        </w:rPr>
-        <w:t xml:space="preserve"> ng</w:t>
-      </w:r>
-      <w:r>
-        <w:rPr>
-          <w:lang w:val="en-US"/>
-        </w:rPr>
-        <w:t xml:space="preserve"> </w:t>
-      </w:r>
-      <w:r>
-        <w:rPr>
-          <w:lang w:val="en-US"/>
-        </w:rPr>
-        <w:tab/>
-        <w:t>${</w:t>
-      </w:r>
-      <w:proofErr w:type="spellStart"/>
-      <w:r>
-        <w:rPr>
-          <w:lang w:val="en-US"/>
-        </w:rPr>
-        <w:t>scheduled_at</w:t>
-      </w:r>
-      <w:proofErr w:type="spellEnd"/>
-      <w:r>
-        <w:rPr>
-          <w:lang w:val="en-US"/>
-        </w:rPr>
-        <w:t>}</w:t>
+      <w:r>
+        <w:rPr>
+          <w:lang w:val="en-US"/>
+        </w:rPr>
+        <w:tab/>
+        <w:t>${scheduled_at}</w:t>
       </w:r>
       <w:r>
         <w:rPr>
@@ -843,49 +686,7 @@
         <w:rPr>
           <w:lang w:val="en-US"/>
         </w:rPr>
-        <w:t xml:space="preserve"> </w:t>
-      </w:r>
-      <w:proofErr w:type="spellStart"/>
-      <w:r>
-        <w:rPr>
-          <w:lang w:val="en-US"/>
-        </w:rPr>
-        <w:t>sa</w:t>
-      </w:r>
-      <w:proofErr w:type="spellEnd"/>
-      <w:r>
-        <w:rPr>
-          <w:lang w:val="en-US"/>
-        </w:rPr>
-        <w:t xml:space="preserve"> </w:t>
-      </w:r>
-      <w:proofErr w:type="spellStart"/>
-      <w:r>
-        <w:rPr>
-          <w:lang w:val="en-US"/>
-        </w:rPr>
-        <w:t>ganap</w:t>
-      </w:r>
-      <w:proofErr w:type="spellEnd"/>
-      <w:r>
-        <w:rPr>
-          <w:lang w:val="en-US"/>
-        </w:rPr>
-        <w:t xml:space="preserve"> ng </w:t>
-      </w:r>
-      <w:proofErr w:type="spellStart"/>
-      <w:r>
-        <w:rPr>
-          <w:lang w:val="en-US"/>
-        </w:rPr>
-        <w:t>ika</w:t>
-      </w:r>
-      <w:proofErr w:type="spellEnd"/>
-      <w:r>
-        <w:rPr>
-          <w:lang w:val="en-US"/>
-        </w:rPr>
-        <w:t xml:space="preserve"> </w:t>
+        <w:t xml:space="preserve"> sa ganap ng ika </w:t>
       </w:r>
       <w:r>
         <w:rPr>
@@ -897,91 +698,7 @@
         <w:rPr>
           <w:lang w:val="en-US"/>
         </w:rPr>
-        <w:t xml:space="preserve"> ng </w:t>
-      </w:r>
-      <w:proofErr w:type="spellStart"/>
-      <w:r>
-        <w:rPr>
-          <w:lang w:val="en-US"/>
-        </w:rPr>
-        <w:t>umaga</w:t>
-      </w:r>
-      <w:proofErr w:type="spellEnd"/>
-      <w:r>
-        <w:rPr>
-          <w:lang w:val="en-US"/>
-        </w:rPr>
-        <w:t xml:space="preserve">/ </w:t>
-      </w:r>
-      <w:proofErr w:type="spellStart"/>
-      <w:r>
-        <w:rPr>
-          <w:lang w:val="en-US"/>
-        </w:rPr>
-        <w:t>hapon</w:t>
-      </w:r>
-      <w:proofErr w:type="spellEnd"/>
-      <w:r>
-        <w:rPr>
-          <w:lang w:val="en-US"/>
-        </w:rPr>
-        <w:t xml:space="preserve"> para </w:t>
-      </w:r>
-      <w:proofErr w:type="spellStart"/>
-      <w:r>
-        <w:rPr>
-          <w:lang w:val="en-US"/>
-        </w:rPr>
-        <w:t>sa</w:t>
-      </w:r>
-      <w:proofErr w:type="spellEnd"/>
-      <w:r>
-        <w:rPr>
-          <w:lang w:val="en-US"/>
-        </w:rPr>
-        <w:t xml:space="preserve"> </w:t>
-      </w:r>
-      <w:proofErr w:type="spellStart"/>
-      <w:r>
-        <w:rPr>
-          <w:lang w:val="en-US"/>
-        </w:rPr>
-        <w:t>pagdinig</w:t>
-      </w:r>
-      <w:proofErr w:type="spellEnd"/>
-      <w:r>
-        <w:rPr>
-          <w:lang w:val="en-US"/>
-        </w:rPr>
-        <w:t xml:space="preserve"> ng </w:t>
-      </w:r>
-      <w:proofErr w:type="spellStart"/>
-      <w:r>
-        <w:rPr>
-          <w:lang w:val="en-US"/>
-        </w:rPr>
-        <w:t>iyong</w:t>
-      </w:r>
-      <w:proofErr w:type="spellEnd"/>
-      <w:r>
-        <w:rPr>
-          <w:lang w:val="en-US"/>
-        </w:rPr>
-        <w:t xml:space="preserve"> </w:t>
-      </w:r>
-      <w:proofErr w:type="spellStart"/>
-      <w:r>
-        <w:rPr>
-          <w:lang w:val="en-US"/>
-        </w:rPr>
-        <w:t>sumbong</w:t>
-      </w:r>
-      <w:proofErr w:type="spellEnd"/>
-      <w:r>
-        <w:rPr>
-          <w:lang w:val="en-US"/>
-        </w:rPr>
-        <w:t>.</w:t>
+        <w:t xml:space="preserve"> ng umaga/ hapon para sa pagdinig ng iyong sumbong.</w:t>
       </w:r>
     </w:p>
     <w:p>
@@ -1011,66 +728,30 @@
       </w:pPr>
       <w:r>
         <w:tab/>
-      </w:r>
-      <w:proofErr w:type="spellStart"/>
-      <w:r>
-        <w:t>Ngayong</w:t>
-      </w:r>
-      <w:proofErr w:type="spellEnd"/>
+        <w:t>Ngayong ika -</w:t>
+      </w:r>
       <w:r>
         <w:t xml:space="preserve"> </w:t>
       </w:r>
-      <w:proofErr w:type="spellStart"/>
-      <w:r>
-        <w:t>ika</w:t>
-      </w:r>
-      <w:proofErr w:type="spellEnd"/>
-      <w:r>
-        <w:t xml:space="preserve"> -</w:t>
+      <w:r>
+        <w:tab/>
+        <w:t>${araw}</w:t>
       </w:r>
       <w:r>
         <w:t xml:space="preserve"> </w:t>
       </w:r>
       <w:r>
         <w:tab/>
-        <w:t>${</w:t>
-      </w:r>
-      <w:proofErr w:type="spellStart"/>
-      <w:r>
-        <w:t>araw</w:t>
-      </w:r>
-      <w:proofErr w:type="spellEnd"/>
-      <w:r>
-        <w:t>}</w:t>
+      </w:r>
+      <w:r>
+        <w:t>araw ng</w:t>
       </w:r>
       <w:r>
         <w:t xml:space="preserve"> </w:t>
       </w:r>
       <w:r>
         <w:tab/>
-      </w:r>
-      <w:proofErr w:type="spellStart"/>
-      <w:r>
-        <w:t>araw</w:t>
-      </w:r>
-      <w:proofErr w:type="spellEnd"/>
-      <w:r>
-        <w:t xml:space="preserve"> ng</w:t>
-      </w:r>
-      <w:r>
-        <w:t xml:space="preserve"> </w:t>
-      </w:r>
-      <w:r>
-        <w:tab/>
-        <w:t>${</w:t>
-      </w:r>
-      <w:proofErr w:type="spellStart"/>
-      <w:r>
-        <w:t>buwan</w:t>
-      </w:r>
-      <w:proofErr w:type="spellEnd"/>
-      <w:r>
-        <w:t>}</w:t>
+        <w:t>${buwan}</w:t>
       </w:r>
       <w:r>
         <w:tab/>
@@ -1261,39 +942,7 @@
                       <w:rFonts w:ascii="Poppins" w:hAnsi="Poppins" w:cs="Poppins"/>
                       <w:lang w:val="en-US"/>
                     </w:rPr>
-                    <w:t>Punong Barangay/</w:t>
-                  </w:r>
-                  <w:proofErr w:type="spellStart"/>
-                  <w:r>
-                    <w:rPr>
-                      <w:rFonts w:ascii="Poppins" w:hAnsi="Poppins" w:cs="Poppins"/>
-                      <w:lang w:val="en-US"/>
-                    </w:rPr>
-                    <w:t>Tagapangulong</w:t>
-                  </w:r>
-                  <w:proofErr w:type="spellEnd"/>
-                  <w:r>
-                    <w:rPr>
-                      <w:rFonts w:ascii="Poppins" w:hAnsi="Poppins" w:cs="Poppins"/>
-                      <w:lang w:val="en-US"/>
-                    </w:rPr>
-                    <w:t xml:space="preserve"> </w:t>
-                  </w:r>
-                  <w:proofErr w:type="spellStart"/>
-                  <w:r>
-                    <w:rPr>
-                      <w:rFonts w:ascii="Poppins" w:hAnsi="Poppins" w:cs="Poppins"/>
-                      <w:lang w:val="en-US"/>
-                    </w:rPr>
-                    <w:t>Lupon</w:t>
-                  </w:r>
-                  <w:proofErr w:type="spellEnd"/>
-                  <w:r>
-                    <w:rPr>
-                      <w:rFonts w:ascii="Poppins" w:hAnsi="Poppins" w:cs="Poppins"/>
-                      <w:lang w:val="en-US"/>
-                    </w:rPr>
-                    <w:t xml:space="preserve"> </w:t>
+                    <w:t xml:space="preserve">Punong Barangay/Tagapangulong Lupon </w:t>
                   </w:r>
                 </w:p>
               </w:txbxContent>
@@ -1360,210 +1009,166 @@
         <w:ind w:left="1440"/>
         <w:jc w:val="both"/>
       </w:pPr>
-      <w:proofErr w:type="spellStart"/>
-      <w:r>
-        <w:t>Pinaabisuhan</w:t>
-      </w:r>
-      <w:proofErr w:type="spellEnd"/>
+      <w:r>
+        <w:t>Pinaabisuhan ngayong</w:t>
+      </w:r>
       <w:r>
         <w:t xml:space="preserve"> </w:t>
       </w:r>
-      <w:proofErr w:type="spellStart"/>
-      <w:r>
-        <w:t>ngayong</w:t>
-      </w:r>
-      <w:proofErr w:type="spellEnd"/>
+      <w:r>
+        <w:tab/>
+        <w:t>${araw}</w:t>
+      </w:r>
+      <w:r>
+        <w:tab/>
+      </w:r>
+      <w:r>
+        <w:t>araw</w:t>
+      </w:r>
       <w:r>
         <w:t xml:space="preserve"> </w:t>
       </w:r>
       <w:r>
         <w:tab/>
+        <w:t>${buwan}</w:t>
+      </w:r>
+      <w:r>
+        <w:tab/>
+      </w:r>
+      <w:r>
+        <w:t>,20</w:t>
+      </w:r>
+      <w:r>
+        <w:rPr>
+          <w:lang w:val="en-US"/>
+        </w:rPr>
+        <w:t>2</w:t>
+      </w:r>
+      <w:r>
+        <w:rPr>
+          <w:lang w:val="en-US"/>
+        </w:rPr>
+        <w:t>6</w:t>
+      </w:r>
+      <w:r>
+        <w:t>.</w:t>
+      </w:r>
+    </w:p>
+    <w:p>
+      <w:pPr>
+        <w:pStyle w:val="NoSpacing"/>
+        <w:ind w:left="1440"/>
+        <w:jc w:val="both"/>
+      </w:pPr>
+    </w:p>
+    <w:p>
+      <w:pPr>
+        <w:pStyle w:val="NoSpacing"/>
+        <w:ind w:left="1440"/>
+        <w:jc w:val="both"/>
+      </w:pPr>
+      <w:r>
+        <w:tab/>
+      </w:r>
+      <w:r>
+        <w:tab/>
+      </w:r>
+      <w:r>
+        <w:tab/>
+      </w:r>
+      <w:r>
+        <w:tab/>
+      </w:r>
+      <w:r>
+        <w:tab/>
+      </w:r>
+    </w:p>
+    <w:p>
+      <w:pPr>
+        <w:pStyle w:val="NoSpacing"/>
+        <w:jc w:val="both"/>
+      </w:pPr>
+    </w:p>
+    <w:p>
+      <w:pPr>
+        <w:pStyle w:val="NoSpacing"/>
+        <w:jc w:val="both"/>
+        <w:rPr>
+          <w:u w:val="single"/>
+        </w:rPr>
+      </w:pPr>
+      <w:r>
+        <w:tab/>
+      </w:r>
+      <w:r>
+        <w:tab/>
+      </w:r>
+      <w:r>
+        <w:tab/>
+      </w:r>
+      <w:r>
+        <w:tab/>
+      </w:r>
+      <w:r>
+        <w:tab/>
+      </w:r>
+      <w:r>
+        <w:tab/>
+      </w:r>
+      <w:r>
+        <w:rPr>
+          <w:lang w:val="en-US"/>
+        </w:rPr>
+        <w:tab/>
+      </w:r>
+      <w:r>
+        <w:rPr>
+          <w:lang w:val="en-US"/>
+        </w:rPr>
+        <w:tab/>
+      </w:r>
+      <w:r>
+        <w:rPr>
+          <w:lang w:val="en-US"/>
+        </w:rPr>
+        <w:tab/>
+      </w:r>
+      <w:r>
+        <w:rPr>
+          <w:lang w:val="en-US"/>
+        </w:rPr>
+        <w:tab/>
+      </w:r>
+      <w:r>
+        <w:rPr>
+          <w:u w:val="single"/>
+          <w:lang w:val="en-US"/>
+        </w:rPr>
+        <w:t xml:space="preserve">           </w:t>
+      </w:r>
+      <w:r>
+        <w:rPr>
+          <w:u w:val="single"/>
+        </w:rPr>
         <w:t>${</w:t>
       </w:r>
-      <w:proofErr w:type="spellStart"/>
-      <w:r>
-        <w:t>araw</w:t>
-      </w:r>
-      <w:proofErr w:type="spellEnd"/>
-      <w:r>
-        <w:t>}</w:t>
-      </w:r>
-      <w:r>
-        <w:tab/>
-      </w:r>
-      <w:proofErr w:type="spellStart"/>
-      <w:r>
-        <w:t>araw</w:t>
-      </w:r>
-      <w:proofErr w:type="spellEnd"/>
-      <w:r>
-        <w:t xml:space="preserve"> </w:t>
-      </w:r>
-      <w:r>
-        <w:tab/>
-        <w:t>${</w:t>
-      </w:r>
-      <w:proofErr w:type="spellStart"/>
-      <w:r>
-        <w:t>buwan</w:t>
-      </w:r>
-      <w:proofErr w:type="spellEnd"/>
-      <w:r>
-        <w:t>}</w:t>
-      </w:r>
-      <w:r>
-        <w:tab/>
-      </w:r>
-      <w:r>
-        <w:t>,20</w:t>
-      </w:r>
-      <w:r>
-        <w:rPr>
-          <w:lang w:val="en-US"/>
-        </w:rPr>
-        <w:t>2</w:t>
-      </w:r>
-      <w:r>
-        <w:rPr>
-          <w:lang w:val="en-US"/>
-        </w:rPr>
-        <w:t>6</w:t>
-      </w:r>
-      <w:r>
-        <w:t>.</w:t>
-      </w:r>
-    </w:p>
-    <w:p>
-      <w:pPr>
-        <w:pStyle w:val="NoSpacing"/>
-        <w:ind w:left="1440"/>
-        <w:jc w:val="both"/>
-      </w:pPr>
-    </w:p>
-    <w:p>
-      <w:pPr>
-        <w:pStyle w:val="NoSpacing"/>
-        <w:ind w:left="1440"/>
-        <w:jc w:val="both"/>
-      </w:pPr>
-      <w:r>
-        <w:tab/>
-      </w:r>
-      <w:r>
-        <w:tab/>
-      </w:r>
-      <w:r>
-        <w:tab/>
-      </w:r>
-      <w:r>
-        <w:tab/>
-      </w:r>
-      <w:r>
-        <w:tab/>
-      </w:r>
-    </w:p>
-    <w:p>
-      <w:pPr>
-        <w:pStyle w:val="NoSpacing"/>
-        <w:jc w:val="both"/>
-      </w:pPr>
-    </w:p>
-    <w:p>
-      <w:pPr>
-        <w:pStyle w:val="NoSpacing"/>
-        <w:jc w:val="both"/>
+      <w:r>
         <w:rPr>
           <w:u w:val="single"/>
         </w:rPr>
-      </w:pPr>
-      <w:r>
-        <w:tab/>
-      </w:r>
-      <w:r>
-        <w:tab/>
-      </w:r>
-      <w:r>
-        <w:tab/>
-      </w:r>
-      <w:r>
-        <w:tab/>
-      </w:r>
-      <w:r>
-        <w:tab/>
-      </w:r>
-      <w:r>
-        <w:tab/>
-      </w:r>
-      <w:r>
-        <w:rPr>
-          <w:lang w:val="en-US"/>
-        </w:rPr>
-        <w:tab/>
-      </w:r>
-      <w:r>
-        <w:rPr>
-          <w:lang w:val="en-US"/>
-        </w:rPr>
-        <w:tab/>
-      </w:r>
-      <w:r>
-        <w:rPr>
-          <w:lang w:val="en-US"/>
-        </w:rPr>
-        <w:tab/>
-      </w:r>
-      <w:r>
-        <w:rPr>
-          <w:lang w:val="en-US"/>
-        </w:rPr>
-        <w:tab/>
+        <w:t>respondent</w:t>
       </w:r>
       <w:r>
         <w:rPr>
           <w:u w:val="single"/>
-          <w:lang w:val="en-US"/>
-        </w:rPr>
-        <w:t xml:space="preserve">           </w:t>
+        </w:rPr>
+        <w:t>_full_name}</w:t>
       </w:r>
       <w:r>
         <w:rPr>
           <w:u w:val="single"/>
         </w:rPr>
-        <w:t>${</w:t>
-      </w:r>
-      <w:proofErr w:type="spellStart"/>
-      <w:r>
-        <w:rPr>
-          <w:u w:val="single"/>
-        </w:rPr>
-        <w:t>complainant_full_</w:t>
-      </w:r>
-      <w:proofErr w:type="gramStart"/>
-      <w:r>
-        <w:rPr>
-          <w:u w:val="single"/>
-        </w:rPr>
-        <w:t>name</w:t>
-      </w:r>
-      <w:proofErr w:type="spellEnd"/>
-      <w:r>
-        <w:rPr>
-          <w:u w:val="single"/>
-        </w:rPr>
-        <w:t>}</w:t>
-      </w:r>
-      <w:r>
-        <w:rPr>
-          <w:u w:val="single"/>
-        </w:rPr>
-        <w:t>_</w:t>
-      </w:r>
-      <w:proofErr w:type="gramEnd"/>
-      <w:r>
-        <w:rPr>
-          <w:u w:val="single"/>
-        </w:rPr>
-        <w:t>__</w:t>
+        <w:t>___</w:t>
       </w:r>
       <w:r>
         <w:rPr>
@@ -1634,13 +1239,11 @@
         <w:jc w:val="both"/>
       </w:pPr>
       <w:r>
-        <w:t>(</w:t>
-      </w:r>
-      <w:proofErr w:type="gramStart"/>
-      <w:r>
-        <w:t>Mga)  Maysumbong</w:t>
-      </w:r>
-      <w:proofErr w:type="gramEnd"/>
+        <w:t xml:space="preserve">(Mga)  </w:t>
+      </w:r>
+      <w:r>
+        <w:t>Inirereklamo</w:t>
+      </w:r>
     </w:p>
     <w:p>
       <w:pPr>

</xml_diff>